<commit_message>
M9.0: pair-1 fixtures in the REAL sheet / document shape
STTM: meta r1-r10 (TBD / .dat / blanks, no Load Strategy row), bands
A14:I14, K14:P14, R14:W14, Y14:AD14, 27 headers over 30 columns (J / Q / X
empty), schema + table constants on every data row, Header / Details /
Trailer banner rows, one "Do Not Map" row without a data type.
FRD: Target Table Name = inline layer block, Target Catalog and Schema
blank, Object Name = "<label>: <file>" lines (names no feed), Name = a
sentence. Values stay the aliased golden's; the FAQ fixture follows the
derived feed id (vnd_p_accum_client).

Source: the two captures on acfc-hotfix-1 (not merged); scrubbed record in
docs/acfc/M9_FINDINGS.md. Commits M9.0-M9.4 are split by path and green
together (suite run on the M9.5 tree), not one by one.

Co-Authored-By: Claude Fable 5.1 <noreply@anthropic.com>
</commit_message>
<xml_diff>
--- a/fixtures/acfc_shapes/frd/f1_pair_1.docx
+++ b/fixtures/acfc_shapes/frd/f1_pair_1.docx
@@ -393,7 +393,7 @@
         <w:tc>
           <w:p>
             <w:r>
-              <w:t xml:space="preserve">Accumulators</w:t>
+              <w:t xml:space="preserve">Descriptive Metadata for the ingestion of Pharmacy Accumulators Inbound files from VENDOR_A into Lake House</w:t>
             </w:r>
           </w:p>
         </w:tc>
@@ -485,7 +485,25 @@
         <w:tc>
           <w:p>
             <w:r>
-              <w:t xml:space="preserve">Accumulators</w:t>
+              <w:t xml:space="preserve">LOB_A outbound: I_ACCUM_*_TO_CLIENT_*.csv</w:t>
+            </w:r>
+            <w:r>
+              <w:br/>
+            </w:r>
+            <w:r>
+              <w:t xml:space="preserve">LOB_A inbound: I_ACCUM_*_FROM_CLIENT_*.csv</w:t>
+            </w:r>
+            <w:r>
+              <w:br/>
+            </w:r>
+            <w:r>
+              <w:t xml:space="preserve">LOB_B outbound: F_ACCUM_*_TO_CLIENT_*.csv</w:t>
+            </w:r>
+            <w:r>
+              <w:br/>
+            </w:r>
+            <w:r>
+              <w:t xml:space="preserve">LOB_B inbound: F_ACCUM_*_FROM_CLIENT_*.csv</w:t>
             </w:r>
           </w:p>
         </w:tc>
@@ -577,7 +595,13 @@
         <w:tc>
           <w:p>
             <w:r>
-              <w:t xml:space="preserve">pharmacy; accumulator</w:t>
+              <w:t xml:space="preserve">Domain: Pharmacy</w:t>
+            </w:r>
+            <w:r>
+              <w:br/>
+            </w:r>
+            <w:r>
+              <w:t xml:space="preserve">Subdomain: Accumulators</w:t>
             </w:r>
           </w:p>
         </w:tc>
@@ -919,11 +943,7 @@
           </w:p>
         </w:tc>
         <w:tc>
-          <w:p>
-            <w:r>
-              <w:t xml:space="preserve">STG: pr_dlk_vnd_p.stg_vnd_p_accum; STD: pr_std_vnd_p.accum</w:t>
-            </w:r>
-          </w:p>
+          <w:p/>
         </w:tc>
       </w:tr>
       <w:tr>
@@ -944,7 +964,25 @@
         <w:tc>
           <w:p>
             <w:r>
-              <w:t xml:space="preserve">vnd_p_accum_client</w:t>
+              <w:t xml:space="preserve">Staging Layer:</w:t>
+            </w:r>
+            <w:r>
+              <w:br/>
+            </w:r>
+            <w:r>
+              <w:t xml:space="preserve">Table: vnd_p_accum_client</w:t>
+            </w:r>
+            <w:r>
+              <w:br/>
+            </w:r>
+            <w:r>
+              <w:t xml:space="preserve">Standard Layer:</w:t>
+            </w:r>
+            <w:r>
+              <w:br/>
+            </w:r>
+            <w:r>
+              <w:t xml:space="preserve">Table: vnd_p_accum_client</w:t>
             </w:r>
           </w:p>
         </w:tc>

</xml_diff>

<commit_message>
M9.1b (1/4): Object Name as a block; pair-1 fixtures in the real-run shapes
The real Object Name cell (acfc-runs: PAIR1_REAL_RUN.md) is stanzas — a
"<line of business>:" line, the file pattern on the NEXT line; v0.5.1 read only
"<label>: <file>" on one line, so the FRD yielded no pattern. A multi-line
block or a nested label | value table is now read per line / row: feed name
from a feed-name label's value, files from a File-Name-type label or any
file-like value under another label; unlabelled values are never taken.
Fixture: the stanza cell; STTM meta rows 11-12 restored (Load Strategy =
Append, Notes) — the first capture stopped at r10.

Co-Authored-By: Claude Fable 5.1 <noreply@anthropic.com>
</commit_message>
<xml_diff>
--- a/fixtures/acfc_shapes/frd/f1_pair_1.docx
+++ b/fixtures/acfc_shapes/frd/f1_pair_1.docx
@@ -485,25 +485,49 @@
         <w:tc>
           <w:p>
             <w:r>
-              <w:t xml:space="preserve">LOB_A outbound: I_ACCUM_*_TO_CLIENT_*.csv</w:t>
+              <w:t xml:space="preserve">LOB_A outbound:</w:t>
             </w:r>
             <w:r>
               <w:br/>
             </w:r>
             <w:r>
-              <w:t xml:space="preserve">LOB_A inbound: I_ACCUM_*_FROM_CLIENT_*.csv</w:t>
+              <w:t xml:space="preserve">I_ACCUM_*_TO_CLIENT_*.csv</w:t>
             </w:r>
             <w:r>
               <w:br/>
             </w:r>
             <w:r>
-              <w:t xml:space="preserve">LOB_B outbound: F_ACCUM_*_TO_CLIENT_*.csv</w:t>
+              <w:t xml:space="preserve">LOB_A inbound:</w:t>
             </w:r>
             <w:r>
               <w:br/>
             </w:r>
             <w:r>
-              <w:t xml:space="preserve">LOB_B inbound: F_ACCUM_*_FROM_CLIENT_*.csv</w:t>
+              <w:t xml:space="preserve">I_ACCUM_*_FROM_CLIENT_*.csv</w:t>
+            </w:r>
+            <w:r>
+              <w:br/>
+            </w:r>
+            <w:r>
+              <w:t xml:space="preserve">LOB_B outbound:</w:t>
+            </w:r>
+            <w:r>
+              <w:br/>
+            </w:r>
+            <w:r>
+              <w:t xml:space="preserve">F_ACCUM_*_TO_CLIENT_*.csv</w:t>
+            </w:r>
+            <w:r>
+              <w:br/>
+            </w:r>
+            <w:r>
+              <w:t xml:space="preserve">LOB_B inbound:</w:t>
+            </w:r>
+            <w:r>
+              <w:br/>
+            </w:r>
+            <w:r>
+              <w:t xml:space="preserve">F_ACCUM_*_FROM_CLIENT_*.csv</w:t>
             </w:r>
           </w:p>
         </w:tc>

</xml_diff>